<commit_message>
docs(whitepaper): fix title, authors, subtitle text
- Subtitle corrected: "The Death of the Bit" (not Trit — the bit is
  what ternary replaces; conclusion paragraph updated to match)
- Subtitle scaled down with \normalfont\normalsize\itshape so it no
  longer inherits the IEEE bold title style
- Authors restructured as individual IEEEauthorblockN/A blocks with
  role, LinkedIn link, and email for each of the five team members
- Re-rendered v2.0.0.docx and v2.0.0.pdf

Co-Authored-By: Claude Sonnet 4.6 <noreply@anthropic.com>
</commit_message>
<xml_diff>
--- a/ternlang-root/docs/whitepaper/ternlang-whitepaper-v2.0.0.docx
+++ b/ternlang-root/docs/whitepaper/ternlang-whitepaper-v2.0.0.docx
@@ -213,7 +213,7 @@
           <w:i/>
           <w:iCs/>
         </w:rPr>
-        <w:t xml:space="preserve">Trit</w:t>
+        <w:t xml:space="preserve">Bit</w:t>
       </w:r>
     </w:p>
     <w:p>
@@ -221,25 +221,10 @@
         <w:pStyle w:val="Author"/>
       </w:pPr>
       <w:r>
-        <w:t xml:space="preserve">Simeon Kepp, Zabih Karimi, Nikoletta Csonka, Lisa Scharler, Louis Paul Ehrig</w:t>
-      </w:r>
-      <w:r>
-        <w:t xml:space="preserve"> </w:t>
-      </w:r>
-      <w:r>
         <w:rPr>
           <w:rStyle w:val="FootnoteReference"/>
         </w:rPr>
         <w:footnoteReference w:id="20"/>
-      </w:r>
-      <w:r>
-        <w:t xml:space="preserve"> </w:t>
-      </w:r>
-      <w:r>
-        <w:rPr>
-          <w:rStyle w:val="FootnoteReference"/>
-        </w:rPr>
-        <w:footnoteReference w:id="22"/>
       </w:r>
     </w:p>
     <w:p>
@@ -3336,7 +3321,7 @@
         <w:t xml:space="preserve">self-evolving neural networks, consumer CPU inference, ecocentric AI, WebAssembly</w:t>
       </w:r>
     </w:p>
-    <w:bookmarkStart w:id="23" w:name="sec:intro"/>
+    <w:bookmarkStart w:id="22" w:name="sec:intro"/>
     <w:p>
       <w:pPr>
         <w:pStyle w:val="Heading1"/>
@@ -4086,8 +4071,8 @@
         <w:t xml:space="preserve">.</w:t>
       </w:r>
     </w:p>
-    <w:bookmarkEnd w:id="23"/>
-    <w:bookmarkStart w:id="28" w:name="sec:background"/>
+    <w:bookmarkEnd w:id="22"/>
+    <w:bookmarkStart w:id="27" w:name="sec:background"/>
     <w:p>
       <w:pPr>
         <w:pStyle w:val="Heading1"/>
@@ -4096,7 +4081,7 @@
         <w:t xml:space="preserve">Background: Balanced Ternary</w:t>
       </w:r>
     </w:p>
-    <w:bookmarkStart w:id="25" w:name="trit-arithmetic"/>
+    <w:bookmarkStart w:id="24" w:name="trit-arithmetic"/>
     <w:p>
       <w:pPr>
         <w:pStyle w:val="Heading2"/>
@@ -4524,7 +4509,7 @@
         <w:t xml:space="preserve">The complete sum/carry table is:</w:t>
       </w:r>
     </w:p>
-    <w:bookmarkStart w:id="24" w:name="tab:add"/>
+    <w:bookmarkStart w:id="23" w:name="tab:add"/>
     <w:p>
       <w:pPr>
         <w:pStyle w:val="TableCaption"/>
@@ -5059,7 +5044,7 @@
         </w:tc>
       </w:tr>
     </w:tbl>
-    <w:bookmarkEnd w:id="24"/>
+    <w:bookmarkEnd w:id="23"/>
     <w:p>
       <w:pPr>
         <w:pStyle w:val="BodyText"/>
@@ -5597,8 +5582,8 @@
         <w:t xml:space="preserve">.</w:t>
       </w:r>
     </w:p>
-    <w:bookmarkEnd w:id="25"/>
-    <w:bookmarkStart w:id="27" w:name="the-2-bit-bet-encoding"/>
+    <w:bookmarkEnd w:id="24"/>
+    <w:bookmarkStart w:id="26" w:name="the-2-bit-bet-encoding"/>
     <w:p>
       <w:pPr>
         <w:pStyle w:val="Heading2"/>
@@ -5615,7 +5600,7 @@
         <w:t xml:space="preserve">Hardware naturally operates in binary. We encode trits as 2-bit pairs:</w:t>
       </w:r>
     </w:p>
-    <w:bookmarkStart w:id="26" w:name="tab:encoding"/>
+    <w:bookmarkStart w:id="25" w:name="tab:encoding"/>
     <w:p>
       <w:pPr>
         <w:pStyle w:val="TableCaption"/>
@@ -5864,7 +5849,7 @@
         </w:tc>
       </w:tr>
     </w:tbl>
-    <w:bookmarkEnd w:id="26"/>
+    <w:bookmarkEnd w:id="25"/>
     <w:p>
       <w:pPr>
         <w:pStyle w:val="BodyText"/>
@@ -6182,9 +6167,9 @@
         <w:t xml:space="preserve">(swap bits).</w:t>
       </w:r>
     </w:p>
+    <w:bookmarkEnd w:id="26"/>
     <w:bookmarkEnd w:id="27"/>
-    <w:bookmarkEnd w:id="28"/>
-    <w:bookmarkStart w:id="35" w:name="sec:language"/>
+    <w:bookmarkStart w:id="34" w:name="sec:language"/>
     <w:p>
       <w:pPr>
         <w:pStyle w:val="Heading1"/>
@@ -6193,7 +6178,7 @@
         <w:t xml:space="preserve">The Ternlang Language</w:t>
       </w:r>
     </w:p>
-    <w:bookmarkStart w:id="29" w:name="design-principles"/>
+    <w:bookmarkStart w:id="28" w:name="design-principles"/>
     <w:p>
       <w:pPr>
         <w:pStyle w:val="Heading2"/>
@@ -6441,198 +6426,198 @@
         <w:t xml:space="preserve">in the source language, not discovered by the optimizer.</w:t>
       </w:r>
     </w:p>
+    <w:bookmarkEnd w:id="28"/>
+    <w:bookmarkStart w:id="29" w:name="core-language-constructs"/>
+    <w:p>
+      <w:pPr>
+        <w:pStyle w:val="Heading2"/>
+      </w:pPr>
+      <w:r>
+        <w:t xml:space="preserve">Core language constructs</w:t>
+      </w:r>
+    </w:p>
+    <w:p>
+      <w:pPr>
+        <w:pStyle w:val="SourceCode"/>
+      </w:pPr>
+      <w:r>
+        <w:rPr>
+          <w:rStyle w:val="VerbatimChar"/>
+        </w:rPr>
+        <w:t xml:space="preserve">fn classify(signal: trit) -&gt; trit {</w:t>
+      </w:r>
+      <w:r>
+        <w:br/>
+      </w:r>
+      <w:r>
+        <w:rPr>
+          <w:rStyle w:val="VerbatimChar"/>
+        </w:rPr>
+        <w:t xml:space="preserve">    match signal {</w:t>
+      </w:r>
+      <w:r>
+        <w:br/>
+      </w:r>
+      <w:r>
+        <w:rPr>
+          <w:rStyle w:val="VerbatimChar"/>
+        </w:rPr>
+        <w:t xml:space="preserve">        -1 =&gt; conflict()  // disagreement confirmed</w:t>
+      </w:r>
+      <w:r>
+        <w:br/>
+      </w:r>
+      <w:r>
+        <w:rPr>
+          <w:rStyle w:val="VerbatimChar"/>
+        </w:rPr>
+        <w:t xml:space="preserve">         0 =&gt; hold()      // awaiting evidence</w:t>
+      </w:r>
+      <w:r>
+        <w:br/>
+      </w:r>
+      <w:r>
+        <w:rPr>
+          <w:rStyle w:val="VerbatimChar"/>
+        </w:rPr>
+        <w:t xml:space="preserve">        +1 =&gt; truth()     // assertion confirmed</w:t>
+      </w:r>
+      <w:r>
+        <w:br/>
+      </w:r>
+      <w:r>
+        <w:rPr>
+          <w:rStyle w:val="VerbatimChar"/>
+        </w:rPr>
+        <w:t xml:space="preserve">    }</w:t>
+      </w:r>
+      <w:r>
+        <w:br/>
+      </w:r>
+      <w:r>
+        <w:rPr>
+          <w:rStyle w:val="VerbatimChar"/>
+        </w:rPr>
+        <w:t xml:space="preserve">}</w:t>
+      </w:r>
+    </w:p>
+    <w:p>
+      <w:pPr>
+        <w:pStyle w:val="SourceCode"/>
+      </w:pPr>
+      <w:r>
+        <w:rPr>
+          <w:rStyle w:val="VerbatimChar"/>
+        </w:rPr>
+        <w:t xml:space="preserve">// Route to TSPARSE_MATMUL at the ISA level</w:t>
+      </w:r>
+      <w:r>
+        <w:br/>
+      </w:r>
+      <w:r>
+        <w:rPr>
+          <w:rStyle w:val="VerbatimChar"/>
+        </w:rPr>
+        <w:t xml:space="preserve">@sparseskip</w:t>
+      </w:r>
+      <w:r>
+        <w:br/>
+      </w:r>
+      <w:r>
+        <w:rPr>
+          <w:rStyle w:val="VerbatimChar"/>
+        </w:rPr>
+        <w:t xml:space="preserve">let output: trittensor&lt;8 x 8&gt; =</w:t>
+      </w:r>
+      <w:r>
+        <w:br/>
+      </w:r>
+      <w:r>
+        <w:rPr>
+          <w:rStyle w:val="VerbatimChar"/>
+        </w:rPr>
+        <w:t xml:space="preserve">    matmul(input, weights);</w:t>
+      </w:r>
+    </w:p>
+    <w:p>
+      <w:pPr>
+        <w:pStyle w:val="SourceCode"/>
+      </w:pPr>
+      <w:r>
+        <w:rPr>
+          <w:rStyle w:val="VerbatimChar"/>
+        </w:rPr>
+        <w:t xml:space="preserve">agent Voter {</w:t>
+      </w:r>
+      <w:r>
+        <w:br/>
+      </w:r>
+      <w:r>
+        <w:rPr>
+          <w:rStyle w:val="VerbatimChar"/>
+        </w:rPr>
+        <w:t xml:space="preserve">    fn handle(msg: trit) -&gt; trit {</w:t>
+      </w:r>
+      <w:r>
+        <w:br/>
+      </w:r>
+      <w:r>
+        <w:rPr>
+          <w:rStyle w:val="VerbatimChar"/>
+        </w:rPr>
+        <w:t xml:space="preserve">        consensus(msg, hold())</w:t>
+      </w:r>
+      <w:r>
+        <w:br/>
+      </w:r>
+      <w:r>
+        <w:rPr>
+          <w:rStyle w:val="VerbatimChar"/>
+        </w:rPr>
+        <w:t xml:space="preserve">    }</w:t>
+      </w:r>
+      <w:r>
+        <w:br/>
+      </w:r>
+      <w:r>
+        <w:rPr>
+          <w:rStyle w:val="VerbatimChar"/>
+        </w:rPr>
+        <w:t xml:space="preserve">}</w:t>
+      </w:r>
+      <w:r>
+        <w:br/>
+      </w:r>
+      <w:r>
+        <w:br/>
+      </w:r>
+      <w:r>
+        <w:rPr>
+          <w:rStyle w:val="VerbatimChar"/>
+        </w:rPr>
+        <w:t xml:space="preserve">let v: agentref = spawn Voter;</w:t>
+      </w:r>
+      <w:r>
+        <w:br/>
+      </w:r>
+      <w:r>
+        <w:rPr>
+          <w:rStyle w:val="VerbatimChar"/>
+        </w:rPr>
+        <w:t xml:space="preserve">send v truth();</w:t>
+      </w:r>
+      <w:r>
+        <w:br/>
+      </w:r>
+      <w:r>
+        <w:rPr>
+          <w:rStyle w:val="VerbatimChar"/>
+        </w:rPr>
+        <w:t xml:space="preserve">let decision: trit = await v;</w:t>
+      </w:r>
+    </w:p>
     <w:bookmarkEnd w:id="29"/>
-    <w:bookmarkStart w:id="30" w:name="core-language-constructs"/>
-    <w:p>
-      <w:pPr>
-        <w:pStyle w:val="Heading2"/>
-      </w:pPr>
-      <w:r>
-        <w:t xml:space="preserve">Core language constructs</w:t>
-      </w:r>
-    </w:p>
-    <w:p>
-      <w:pPr>
-        <w:pStyle w:val="SourceCode"/>
-      </w:pPr>
-      <w:r>
-        <w:rPr>
-          <w:rStyle w:val="VerbatimChar"/>
-        </w:rPr>
-        <w:t xml:space="preserve">fn classify(signal: trit) -&gt; trit {</w:t>
-      </w:r>
-      <w:r>
-        <w:br/>
-      </w:r>
-      <w:r>
-        <w:rPr>
-          <w:rStyle w:val="VerbatimChar"/>
-        </w:rPr>
-        <w:t xml:space="preserve">    match signal {</w:t>
-      </w:r>
-      <w:r>
-        <w:br/>
-      </w:r>
-      <w:r>
-        <w:rPr>
-          <w:rStyle w:val="VerbatimChar"/>
-        </w:rPr>
-        <w:t xml:space="preserve">        -1 =&gt; conflict()  // disagreement confirmed</w:t>
-      </w:r>
-      <w:r>
-        <w:br/>
-      </w:r>
-      <w:r>
-        <w:rPr>
-          <w:rStyle w:val="VerbatimChar"/>
-        </w:rPr>
-        <w:t xml:space="preserve">         0 =&gt; hold()      // awaiting evidence</w:t>
-      </w:r>
-      <w:r>
-        <w:br/>
-      </w:r>
-      <w:r>
-        <w:rPr>
-          <w:rStyle w:val="VerbatimChar"/>
-        </w:rPr>
-        <w:t xml:space="preserve">        +1 =&gt; truth()     // assertion confirmed</w:t>
-      </w:r>
-      <w:r>
-        <w:br/>
-      </w:r>
-      <w:r>
-        <w:rPr>
-          <w:rStyle w:val="VerbatimChar"/>
-        </w:rPr>
-        <w:t xml:space="preserve">    }</w:t>
-      </w:r>
-      <w:r>
-        <w:br/>
-      </w:r>
-      <w:r>
-        <w:rPr>
-          <w:rStyle w:val="VerbatimChar"/>
-        </w:rPr>
-        <w:t xml:space="preserve">}</w:t>
-      </w:r>
-    </w:p>
-    <w:p>
-      <w:pPr>
-        <w:pStyle w:val="SourceCode"/>
-      </w:pPr>
-      <w:r>
-        <w:rPr>
-          <w:rStyle w:val="VerbatimChar"/>
-        </w:rPr>
-        <w:t xml:space="preserve">// Route to TSPARSE_MATMUL at the ISA level</w:t>
-      </w:r>
-      <w:r>
-        <w:br/>
-      </w:r>
-      <w:r>
-        <w:rPr>
-          <w:rStyle w:val="VerbatimChar"/>
-        </w:rPr>
-        <w:t xml:space="preserve">@sparseskip</w:t>
-      </w:r>
-      <w:r>
-        <w:br/>
-      </w:r>
-      <w:r>
-        <w:rPr>
-          <w:rStyle w:val="VerbatimChar"/>
-        </w:rPr>
-        <w:t xml:space="preserve">let output: trittensor&lt;8 x 8&gt; =</w:t>
-      </w:r>
-      <w:r>
-        <w:br/>
-      </w:r>
-      <w:r>
-        <w:rPr>
-          <w:rStyle w:val="VerbatimChar"/>
-        </w:rPr>
-        <w:t xml:space="preserve">    matmul(input, weights);</w:t>
-      </w:r>
-    </w:p>
-    <w:p>
-      <w:pPr>
-        <w:pStyle w:val="SourceCode"/>
-      </w:pPr>
-      <w:r>
-        <w:rPr>
-          <w:rStyle w:val="VerbatimChar"/>
-        </w:rPr>
-        <w:t xml:space="preserve">agent Voter {</w:t>
-      </w:r>
-      <w:r>
-        <w:br/>
-      </w:r>
-      <w:r>
-        <w:rPr>
-          <w:rStyle w:val="VerbatimChar"/>
-        </w:rPr>
-        <w:t xml:space="preserve">    fn handle(msg: trit) -&gt; trit {</w:t>
-      </w:r>
-      <w:r>
-        <w:br/>
-      </w:r>
-      <w:r>
-        <w:rPr>
-          <w:rStyle w:val="VerbatimChar"/>
-        </w:rPr>
-        <w:t xml:space="preserve">        consensus(msg, hold())</w:t>
-      </w:r>
-      <w:r>
-        <w:br/>
-      </w:r>
-      <w:r>
-        <w:rPr>
-          <w:rStyle w:val="VerbatimChar"/>
-        </w:rPr>
-        <w:t xml:space="preserve">    }</w:t>
-      </w:r>
-      <w:r>
-        <w:br/>
-      </w:r>
-      <w:r>
-        <w:rPr>
-          <w:rStyle w:val="VerbatimChar"/>
-        </w:rPr>
-        <w:t xml:space="preserve">}</w:t>
-      </w:r>
-      <w:r>
-        <w:br/>
-      </w:r>
-      <w:r>
-        <w:br/>
-      </w:r>
-      <w:r>
-        <w:rPr>
-          <w:rStyle w:val="VerbatimChar"/>
-        </w:rPr>
-        <w:t xml:space="preserve">let v: agentref = spawn Voter;</w:t>
-      </w:r>
-      <w:r>
-        <w:br/>
-      </w:r>
-      <w:r>
-        <w:rPr>
-          <w:rStyle w:val="VerbatimChar"/>
-        </w:rPr>
-        <w:t xml:space="preserve">send v truth();</w:t>
-      </w:r>
-      <w:r>
-        <w:br/>
-      </w:r>
-      <w:r>
-        <w:rPr>
-          <w:rStyle w:val="VerbatimChar"/>
-        </w:rPr>
-        <w:t xml:space="preserve">let decision: trit = await v;</w:t>
-      </w:r>
-    </w:p>
-    <w:bookmarkEnd w:id="30"/>
-    <w:bookmarkStart w:id="31" w:name="type-system"/>
+    <w:bookmarkStart w:id="30" w:name="type-system"/>
     <w:p>
       <w:pPr>
         <w:pStyle w:val="Heading2"/>
@@ -6735,8 +6720,8 @@
         <w:t xml:space="preserve">field-name mangling in the register allocator.</w:t>
       </w:r>
     </w:p>
-    <w:bookmarkEnd w:id="31"/>
-    <w:bookmarkStart w:id="32" w:name="subsec:propagate"/>
+    <w:bookmarkEnd w:id="30"/>
+    <w:bookmarkStart w:id="31" w:name="subsec:propagate"/>
     <w:p>
       <w:pPr>
         <w:pStyle w:val="Heading2"/>
@@ -7251,8 +7236,8 @@
         <w:t xml:space="preserve">}</w:t>
       </w:r>
     </w:p>
-    <w:bookmarkEnd w:id="32"/>
-    <w:bookmarkStart w:id="33" w:name="subsec:modules"/>
+    <w:bookmarkEnd w:id="31"/>
+    <w:bookmarkStart w:id="32" w:name="subsec:modules"/>
     <w:p>
       <w:pPr>
         <w:pStyle w:val="Heading2"/>
@@ -7606,8 +7591,8 @@
         <w:t xml:space="preserve">}</w:t>
       </w:r>
     </w:p>
-    <w:bookmarkEnd w:id="33"/>
-    <w:bookmarkStart w:id="34" w:name="subsec:diagnostics"/>
+    <w:bookmarkEnd w:id="32"/>
+    <w:bookmarkStart w:id="33" w:name="subsec:diagnostics"/>
     <w:p>
       <w:pPr>
         <w:pStyle w:val="Heading2"/>
@@ -7935,9 +7920,9 @@
         <w:t xml:space="preserve">underpinning the type system.</w:t>
       </w:r>
     </w:p>
+    <w:bookmarkEnd w:id="33"/>
     <w:bookmarkEnd w:id="34"/>
-    <w:bookmarkEnd w:id="35"/>
-    <w:bookmarkStart w:id="39" w:name="sec:isa"/>
+    <w:bookmarkStart w:id="38" w:name="sec:isa"/>
     <w:p>
       <w:pPr>
         <w:pStyle w:val="Heading1"/>
@@ -7946,7 +7931,7 @@
         <w:t xml:space="preserve">The BET Instruction Set Architecture</w:t>
       </w:r>
     </w:p>
-    <w:bookmarkStart w:id="36" w:name="machine-model"/>
+    <w:bookmarkStart w:id="35" w:name="machine-model"/>
     <w:p>
       <w:pPr>
         <w:pStyle w:val="Heading2"/>
@@ -8191,8 +8176,8 @@
         <w:t xml:space="preserve">.</w:t>
       </w:r>
     </w:p>
-    <w:bookmarkEnd w:id="36"/>
-    <w:bookmarkStart w:id="38" w:name="instruction-encoding"/>
+    <w:bookmarkEnd w:id="35"/>
+    <w:bookmarkStart w:id="37" w:name="instruction-encoding"/>
     <w:p>
       <w:pPr>
         <w:pStyle w:val="Heading2"/>
@@ -8229,7 +8214,7 @@
         <w:t xml:space="preserve">lists the complete opcode map.</w:t>
       </w:r>
     </w:p>
-    <w:bookmarkStart w:id="37" w:name="tab:isa"/>
+    <w:bookmarkStart w:id="36" w:name="tab:isa"/>
     <w:p>
       <w:pPr>
         <w:pStyle w:val="TableCaption"/>
@@ -9917,10 +9902,10 @@
         </w:tc>
       </w:tr>
     </w:tbl>
+    <w:bookmarkEnd w:id="36"/>
     <w:bookmarkEnd w:id="37"/>
     <w:bookmarkEnd w:id="38"/>
-    <w:bookmarkEnd w:id="39"/>
-    <w:bookmarkStart w:id="46" w:name="sec:sparse"/>
+    <w:bookmarkStart w:id="45" w:name="sec:sparse"/>
     <w:p>
       <w:pPr>
         <w:pStyle w:val="Heading1"/>
@@ -9929,7 +9914,7 @@
         <w:t xml:space="preserve">Sparse Ternary Inference</w:t>
       </w:r>
     </w:p>
-    <w:bookmarkStart w:id="40" w:name="ternary-quantization"/>
+    <w:bookmarkStart w:id="39" w:name="ternary-quantization"/>
     <w:p>
       <w:pPr>
         <w:pStyle w:val="Heading2"/>
@@ -10367,8 +10352,8 @@
         <w:t xml:space="preserve">).</w:t>
       </w:r>
     </w:p>
-    <w:bookmarkEnd w:id="40"/>
-    <w:bookmarkStart w:id="41" w:name="X9f1051f3f18457496e9dfb2b6cd48500bd29a12"/>
+    <w:bookmarkEnd w:id="39"/>
+    <w:bookmarkStart w:id="40" w:name="X9f1051f3f18457496e9dfb2b6cd48500bd29a12"/>
     <w:p>
       <w:pPr>
         <w:pStyle w:val="Heading2"/>
@@ -11085,8 +11070,8 @@
         <w:t xml:space="preserve">runtime optimization that may or may not trigger.</w:t>
       </w:r>
     </w:p>
-    <w:bookmarkEnd w:id="41"/>
-    <w:bookmarkStart w:id="43" w:name="benchmark-results"/>
+    <w:bookmarkEnd w:id="40"/>
+    <w:bookmarkStart w:id="42" w:name="benchmark-results"/>
     <w:p>
       <w:pPr>
         <w:pStyle w:val="Heading2"/>
@@ -11189,7 +11174,7 @@
         <w:t xml:space="preserve">).</w:t>
       </w:r>
     </w:p>
-    <w:bookmarkStart w:id="42" w:name="tab:benchmark"/>
+    <w:bookmarkStart w:id="41" w:name="tab:benchmark"/>
     <w:p>
       <w:pPr>
         <w:pStyle w:val="TableCaption"/>
@@ -11441,7 +11426,7 @@
         </w:tc>
       </w:tr>
     </w:tbl>
-    <w:bookmarkEnd w:id="42"/>
+    <w:bookmarkEnd w:id="41"/>
     <w:p>
       <w:pPr>
         <w:pStyle w:val="BodyText"/>
@@ -11517,8 +11502,8 @@
         <w:t xml:space="preserve">).</w:t>
       </w:r>
     </w:p>
-    <w:bookmarkEnd w:id="43"/>
-    <w:bookmarkStart w:id="45" w:name="subsec:avx2"/>
+    <w:bookmarkEnd w:id="42"/>
+    <w:bookmarkStart w:id="44" w:name="subsec:avx2"/>
     <w:p>
       <w:pPr>
         <w:pStyle w:val="Heading2"/>
@@ -11559,7 +11544,7 @@
         <w:t xml:space="preserve">across three representative sparsity levels on a commodity x86-64 CPU.</w:t>
       </w:r>
     </w:p>
-    <w:bookmarkStart w:id="44" w:name="tab:avx2"/>
+    <w:bookmarkStart w:id="43" w:name="tab:avx2"/>
     <w:p>
       <w:pPr>
         <w:pStyle w:val="TableCaption"/>
@@ -11775,7 +11760,7 @@
         </w:tc>
       </w:tr>
     </w:tbl>
-    <w:bookmarkEnd w:id="44"/>
+    <w:bookmarkEnd w:id="43"/>
     <w:p>
       <w:pPr>
         <w:pStyle w:val="BodyText"/>
@@ -11898,9 +11883,9 @@
         <w:t xml:space="preserve">approximate arithmetic, hardware reconfiguration, or GPU acceleration.</w:t>
       </w:r>
     </w:p>
+    <w:bookmarkEnd w:id="44"/>
     <w:bookmarkEnd w:id="45"/>
-    <w:bookmarkEnd w:id="46"/>
-    <w:bookmarkStart w:id="50" w:name="sec:hdl"/>
+    <w:bookmarkStart w:id="49" w:name="sec:hdl"/>
     <w:p>
       <w:pPr>
         <w:pStyle w:val="Heading1"/>
@@ -11909,7 +11894,7 @@
         <w:t xml:space="preserve">Hardware Backend</w:t>
       </w:r>
     </w:p>
-    <w:bookmarkStart w:id="47" w:name="verilog-2001-primitives"/>
+    <w:bookmarkStart w:id="46" w:name="verilog-2001-primitives"/>
     <w:p>
       <w:pPr>
         <w:pStyle w:val="Heading2"/>
@@ -12103,8 +12088,8 @@
         <w:t xml:space="preserve">: top-level ALU selecting among primitives by op code</w:t>
       </w:r>
     </w:p>
-    <w:bookmarkEnd w:id="47"/>
-    <w:bookmarkStart w:id="48" w:name="sparse-matmul-array"/>
+    <w:bookmarkEnd w:id="46"/>
+    <w:bookmarkStart w:id="47" w:name="sparse-matmul-array"/>
     <w:p>
       <w:pPr>
         <w:pStyle w:val="Heading2"/>
@@ -12502,8 +12487,8 @@
         <w:t xml:space="preserve">zero-weight cells, delivering dynamic power reduction proportional to sparsity.</w:t>
       </w:r>
     </w:p>
-    <w:bookmarkEnd w:id="48"/>
-    <w:bookmarkStart w:id="49" w:name="bet-processor"/>
+    <w:bookmarkEnd w:id="47"/>
+    <w:bookmarkStart w:id="48" w:name="bet-processor"/>
     <w:p>
       <w:pPr>
         <w:pStyle w:val="Heading2"/>
@@ -12647,9 +12632,9 @@
         <w:t xml:space="preserve">initialization, reset sequencing, and VCD waveform export for GTKWave.</w:t>
       </w:r>
     </w:p>
+    <w:bookmarkEnd w:id="48"/>
     <w:bookmarkEnd w:id="49"/>
-    <w:bookmarkEnd w:id="50"/>
-    <w:bookmarkStart w:id="53" w:name="sec:codegen"/>
+    <w:bookmarkStart w:id="52" w:name="sec:codegen"/>
     <w:p>
       <w:pPr>
         <w:pStyle w:val="Heading1"/>
@@ -12705,7 +12690,7 @@
         <w:t xml:space="preserve">output for inspection and security audit.</w:t>
       </w:r>
     </w:p>
-    <w:bookmarkStart w:id="51" w:name="transpilation-architecture"/>
+    <w:bookmarkStart w:id="50" w:name="transpilation-architecture"/>
     <w:p>
       <w:pPr>
         <w:pStyle w:val="Heading2"/>
@@ -13029,8 +13014,8 @@
         <w:t xml:space="preserve">.</w:t>
       </w:r>
     </w:p>
-    <w:bookmarkEnd w:id="51"/>
-    <w:bookmarkStart w:id="52" w:name="language-construct-mapping"/>
+    <w:bookmarkEnd w:id="50"/>
+    <w:bookmarkStart w:id="51" w:name="language-construct-mapping"/>
     <w:p>
       <w:pPr>
         <w:pStyle w:val="Heading2"/>
@@ -13555,24 +13540,296 @@
         <w:t xml:space="preserve">in the output, making the generated file auditable even for unsupported constructs.</w:t>
       </w:r>
     </w:p>
+    <w:bookmarkEnd w:id="51"/>
     <w:bookmarkEnd w:id="52"/>
+    <w:bookmarkStart w:id="55" w:name="sec:actors"/>
+    <w:p>
+      <w:pPr>
+        <w:pStyle w:val="Heading1"/>
+      </w:pPr>
+      <w:r>
+        <w:t xml:space="preserve">Actor Model and Distributed Runtime</w:t>
+      </w:r>
+    </w:p>
+    <w:bookmarkStart w:id="53" w:name="local-actors"/>
+    <w:p>
+      <w:pPr>
+        <w:pStyle w:val="Heading2"/>
+      </w:pPr>
+      <w:r>
+        <w:t xml:space="preserve">Local actors</w:t>
+      </w:r>
+    </w:p>
+    <w:p>
+      <w:pPr>
+        <w:pStyle w:val="FirstParagraph"/>
+      </w:pPr>
+      <w:r>
+        <w:t xml:space="preserve">Ternlang implements the actor model via three ISA primitives:</w:t>
+      </w:r>
+      <w:r>
+        <w:t xml:space="preserve"> </w:t>
+      </w:r>
+      <w:r>
+        <w:rPr>
+          <w:rStyle w:val="VerbatimChar"/>
+        </w:rPr>
+        <w:t xml:space="preserve">TSPAWN</w:t>
+      </w:r>
+      <w:r>
+        <w:t xml:space="preserve"> </w:t>
+      </w:r>
+      <w:r>
+        <w:t xml:space="preserve">creates an agent instance and returns an</w:t>
+      </w:r>
+      <w:r>
+        <w:t xml:space="preserve"> </w:t>
+      </w:r>
+      <w:r>
+        <w:rPr>
+          <w:rStyle w:val="VerbatimChar"/>
+        </w:rPr>
+        <w:t xml:space="preserve">agentref</w:t>
+      </w:r>
+      <w:r>
+        <w:t xml:space="preserve">;</w:t>
+      </w:r>
+      <w:r>
+        <w:t xml:space="preserve"> </w:t>
+      </w:r>
+      <w:r>
+        <w:rPr>
+          <w:rStyle w:val="VerbatimChar"/>
+        </w:rPr>
+        <w:t xml:space="preserve">TSEND</w:t>
+      </w:r>
+      <w:r>
+        <w:t xml:space="preserve"> </w:t>
+      </w:r>
+      <w:r>
+        <w:t xml:space="preserve">enqueues a trit message in the agent’s mailbox;</w:t>
+      </w:r>
+      <w:r>
+        <w:t xml:space="preserve"> </w:t>
+      </w:r>
+      <w:r>
+        <w:rPr>
+          <w:rStyle w:val="VerbatimChar"/>
+        </w:rPr>
+        <w:t xml:space="preserve">TAWAIT</w:t>
+      </w:r>
+      <w:r>
+        <w:t xml:space="preserve"> </w:t>
+      </w:r>
+      <w:r>
+        <w:t xml:space="preserve">dequeues a message, invokes the handler, and returns the trit result. The</w:t>
+      </w:r>
+      <w:r>
+        <w:t xml:space="preserve"> </w:t>
+      </w:r>
+      <w:r>
+        <w:t xml:space="preserve">mailbox is a FIFO (</w:t>
+      </w:r>
+      <w:r>
+        <w:rPr>
+          <w:rStyle w:val="VerbatimChar"/>
+        </w:rPr>
+        <w:t xml:space="preserve">VecDeque&lt;Value&gt;</w:t>
+      </w:r>
+      <w:r>
+        <w:t xml:space="preserve">) allocated per agent instance.</w:t>
+      </w:r>
+    </w:p>
     <w:bookmarkEnd w:id="53"/>
-    <w:bookmarkStart w:id="56" w:name="sec:actors"/>
+    <w:bookmarkStart w:id="54" w:name="distributed-actors"/>
+    <w:p>
+      <w:pPr>
+        <w:pStyle w:val="Heading2"/>
+      </w:pPr>
+      <w:r>
+        <w:t xml:space="preserve">Distributed actors</w:t>
+      </w:r>
+    </w:p>
+    <w:p>
+      <w:pPr>
+        <w:pStyle w:val="FirstParagraph"/>
+      </w:pPr>
+      <w:r>
+        <w:t xml:space="preserve">The</w:t>
+      </w:r>
+      <w:r>
+        <w:t xml:space="preserve"> </w:t>
+      </w:r>
+      <w:r>
+        <w:rPr>
+          <w:rStyle w:val="VerbatimChar"/>
+        </w:rPr>
+        <w:t xml:space="preserve">ternlang-runtime</w:t>
+      </w:r>
+      <w:r>
+        <w:t xml:space="preserve"> </w:t>
+      </w:r>
+      <w:r>
+        <w:t xml:space="preserve">crate extends the actor model to multi-node</w:t>
+      </w:r>
+      <w:r>
+        <w:t xml:space="preserve"> </w:t>
+      </w:r>
+      <w:r>
+        <w:t xml:space="preserve">systems via TCP transport. A</w:t>
+      </w:r>
+      <w:r>
+        <w:t xml:space="preserve"> </w:t>
+      </w:r>
+      <w:r>
+        <w:rPr>
+          <w:rStyle w:val="VerbatimChar"/>
+        </w:rPr>
+        <w:t xml:space="preserve">TernNode</w:t>
+      </w:r>
+      <w:r>
+        <w:t xml:space="preserve"> </w:t>
+      </w:r>
+      <w:r>
+        <w:t xml:space="preserve">binds a TCP port, maintains a</w:t>
+      </w:r>
+      <w:r>
+        <w:t xml:space="preserve"> </w:t>
+      </w:r>
+      <w:r>
+        <w:t xml:space="preserve">peer connection map, and exposes</w:t>
+      </w:r>
+      <w:r>
+        <w:t xml:space="preserve"> </w:t>
+      </w:r>
+      <w:r>
+        <w:rPr>
+          <w:rStyle w:val="VerbatimChar"/>
+        </w:rPr>
+        <w:t xml:space="preserve">remote_send</w:t>
+      </w:r>
+      <w:r>
+        <w:t xml:space="preserve">/</w:t>
+      </w:r>
+      <w:r>
+        <w:rPr>
+          <w:rStyle w:val="VerbatimChar"/>
+        </w:rPr>
+        <w:t xml:space="preserve">remote_await</w:t>
+      </w:r>
+      <w:r>
+        <w:t xml:space="preserve"> </w:t>
+      </w:r>
+      <w:r>
+        <w:t xml:space="preserve">over a newline-delimited JSON wire protocol:</w:t>
+      </w:r>
+    </w:p>
+    <w:p>
+      <w:pPr>
+        <w:pStyle w:val="SourceCode"/>
+      </w:pPr>
+      <w:r>
+        <w:rPr>
+          <w:rStyle w:val="VerbatimChar"/>
+        </w:rPr>
+        <w:t xml:space="preserve">let remote_voter: agentref =</w:t>
+      </w:r>
+      <w:r>
+        <w:br/>
+      </w:r>
+      <w:r>
+        <w:rPr>
+          <w:rStyle w:val="VerbatimChar"/>
+        </w:rPr>
+        <w:t xml:space="preserve">    spawn remote "192.168.1.42:7373" Voter;</w:t>
+      </w:r>
+      <w:r>
+        <w:br/>
+      </w:r>
+      <w:r>
+        <w:rPr>
+          <w:rStyle w:val="VerbatimChar"/>
+        </w:rPr>
+        <w:t xml:space="preserve">send remote_voter truth();</w:t>
+      </w:r>
+      <w:r>
+        <w:br/>
+      </w:r>
+      <w:r>
+        <w:rPr>
+          <w:rStyle w:val="VerbatimChar"/>
+        </w:rPr>
+        <w:t xml:space="preserve">let r: trit = await remote_voter;</w:t>
+      </w:r>
+    </w:p>
+    <w:p>
+      <w:pPr>
+        <w:pStyle w:val="FirstParagraph"/>
+      </w:pPr>
+      <w:r>
+        <w:t xml:space="preserve">The wire protocol uses four message types (</w:t>
+      </w:r>
+      <w:r>
+        <w:rPr>
+          <w:rStyle w:val="VerbatimChar"/>
+        </w:rPr>
+        <w:t xml:space="preserve">Send</w:t>
+      </w:r>
+      <w:r>
+        <w:t xml:space="preserve">,</w:t>
+      </w:r>
+      <w:r>
+        <w:t xml:space="preserve"> </w:t>
+      </w:r>
+      <w:r>
+        <w:rPr>
+          <w:rStyle w:val="VerbatimChar"/>
+        </w:rPr>
+        <w:t xml:space="preserve">Await</w:t>
+      </w:r>
+      <w:r>
+        <w:t xml:space="preserve">,</w:t>
+      </w:r>
+      <w:r>
+        <w:t xml:space="preserve"> </w:t>
+      </w:r>
+      <w:r>
+        <w:rPr>
+          <w:rStyle w:val="VerbatimChar"/>
+        </w:rPr>
+        <w:t xml:space="preserve">Reply</w:t>
+      </w:r>
+      <w:r>
+        <w:t xml:space="preserve">,</w:t>
+      </w:r>
+      <w:r>
+        <w:t xml:space="preserve"> </w:t>
+      </w:r>
+      <w:r>
+        <w:rPr>
+          <w:rStyle w:val="VerbatimChar"/>
+        </w:rPr>
+        <w:t xml:space="preserve">Error</w:t>
+      </w:r>
+      <w:r>
+        <w:t xml:space="preserve">) serialised as tagged JSON objects, enabling</w:t>
+      </w:r>
+      <w:r>
+        <w:t xml:space="preserve"> </w:t>
+      </w:r>
+      <w:r>
+        <w:t xml:space="preserve">interoperability with non-Rust implementations.</w:t>
+      </w:r>
+    </w:p>
+    <w:bookmarkEnd w:id="54"/>
+    <w:bookmarkEnd w:id="55"/>
+    <w:bookmarkStart w:id="60" w:name="sec:reasoning"/>
     <w:p>
       <w:pPr>
         <w:pStyle w:val="Heading1"/>
       </w:pPr>
       <w:r>
-        <w:t xml:space="preserve">Actor Model and Distributed Runtime</w:t>
-      </w:r>
-    </w:p>
-    <w:bookmarkStart w:id="54" w:name="local-actors"/>
-    <w:p>
-      <w:pPr>
-        <w:pStyle w:val="Heading2"/>
-      </w:pPr>
-      <w:r>
-        <w:t xml:space="preserve">Local actors</w:t>
+        <w:t xml:space="preserve">Ternary AI Reasoning Toolkit</w:t>
       </w:r>
     </w:p>
     <w:p>
@@ -13580,7 +13837,33 @@
         <w:pStyle w:val="FirstParagraph"/>
       </w:pPr>
       <w:r>
-        <w:t xml:space="preserve">Ternlang implements the actor model via three ISA primitives:</w:t>
+        <w:t xml:space="preserve">Modern AI agents are structurally binary in their decision loops: evidence</w:t>
+      </w:r>
+      <w:r>
+        <w:t xml:space="preserve"> </w:t>
+      </w:r>
+      <w:r>
+        <w:t xml:space="preserve">is collapsed to a scalar, thresholded, and converted to a Boolean act/wait</w:t>
+      </w:r>
+      <w:r>
+        <w:t xml:space="preserve"> </w:t>
+      </w:r>
+      <w:r>
+        <w:t xml:space="preserve">flag. The three-valued nature of evidence—affirm, hold, reject—is treated</w:t>
+      </w:r>
+      <w:r>
+        <w:t xml:space="preserve"> </w:t>
+      </w:r>
+      <w:r>
+        <w:t xml:space="preserve">as a side-effect of confidence scores rather than a first-class type.</w:t>
+      </w:r>
+    </w:p>
+    <w:p>
+      <w:pPr>
+        <w:pStyle w:val="BodyText"/>
+      </w:pPr>
+      <w:r>
+        <w:t xml:space="preserve">Phase 8 of the TIS introduces five primitives in</w:t>
       </w:r>
       <w:r>
         <w:t xml:space="preserve"> </w:t>
@@ -13589,304 +13872,6 @@
         <w:rPr>
           <w:rStyle w:val="VerbatimChar"/>
         </w:rPr>
-        <w:t xml:space="preserve">TSPAWN</w:t>
-      </w:r>
-      <w:r>
-        <w:t xml:space="preserve"> </w:t>
-      </w:r>
-      <w:r>
-        <w:t xml:space="preserve">creates an agent instance and returns an</w:t>
-      </w:r>
-      <w:r>
-        <w:t xml:space="preserve"> </w:t>
-      </w:r>
-      <w:r>
-        <w:rPr>
-          <w:rStyle w:val="VerbatimChar"/>
-        </w:rPr>
-        <w:t xml:space="preserve">agentref</w:t>
-      </w:r>
-      <w:r>
-        <w:t xml:space="preserve">;</w:t>
-      </w:r>
-      <w:r>
-        <w:t xml:space="preserve"> </w:t>
-      </w:r>
-      <w:r>
-        <w:rPr>
-          <w:rStyle w:val="VerbatimChar"/>
-        </w:rPr>
-        <w:t xml:space="preserve">TSEND</w:t>
-      </w:r>
-      <w:r>
-        <w:t xml:space="preserve"> </w:t>
-      </w:r>
-      <w:r>
-        <w:t xml:space="preserve">enqueues a trit message in the agent’s mailbox;</w:t>
-      </w:r>
-      <w:r>
-        <w:t xml:space="preserve"> </w:t>
-      </w:r>
-      <w:r>
-        <w:rPr>
-          <w:rStyle w:val="VerbatimChar"/>
-        </w:rPr>
-        <w:t xml:space="preserve">TAWAIT</w:t>
-      </w:r>
-      <w:r>
-        <w:t xml:space="preserve"> </w:t>
-      </w:r>
-      <w:r>
-        <w:t xml:space="preserve">dequeues a message, invokes the handler, and returns the trit result. The</w:t>
-      </w:r>
-      <w:r>
-        <w:t xml:space="preserve"> </w:t>
-      </w:r>
-      <w:r>
-        <w:t xml:space="preserve">mailbox is a FIFO (</w:t>
-      </w:r>
-      <w:r>
-        <w:rPr>
-          <w:rStyle w:val="VerbatimChar"/>
-        </w:rPr>
-        <w:t xml:space="preserve">VecDeque&lt;Value&gt;</w:t>
-      </w:r>
-      <w:r>
-        <w:t xml:space="preserve">) allocated per agent instance.</w:t>
-      </w:r>
-    </w:p>
-    <w:bookmarkEnd w:id="54"/>
-    <w:bookmarkStart w:id="55" w:name="distributed-actors"/>
-    <w:p>
-      <w:pPr>
-        <w:pStyle w:val="Heading2"/>
-      </w:pPr>
-      <w:r>
-        <w:t xml:space="preserve">Distributed actors</w:t>
-      </w:r>
-    </w:p>
-    <w:p>
-      <w:pPr>
-        <w:pStyle w:val="FirstParagraph"/>
-      </w:pPr>
-      <w:r>
-        <w:t xml:space="preserve">The</w:t>
-      </w:r>
-      <w:r>
-        <w:t xml:space="preserve"> </w:t>
-      </w:r>
-      <w:r>
-        <w:rPr>
-          <w:rStyle w:val="VerbatimChar"/>
-        </w:rPr>
-        <w:t xml:space="preserve">ternlang-runtime</w:t>
-      </w:r>
-      <w:r>
-        <w:t xml:space="preserve"> </w:t>
-      </w:r>
-      <w:r>
-        <w:t xml:space="preserve">crate extends the actor model to multi-node</w:t>
-      </w:r>
-      <w:r>
-        <w:t xml:space="preserve"> </w:t>
-      </w:r>
-      <w:r>
-        <w:t xml:space="preserve">systems via TCP transport. A</w:t>
-      </w:r>
-      <w:r>
-        <w:t xml:space="preserve"> </w:t>
-      </w:r>
-      <w:r>
-        <w:rPr>
-          <w:rStyle w:val="VerbatimChar"/>
-        </w:rPr>
-        <w:t xml:space="preserve">TernNode</w:t>
-      </w:r>
-      <w:r>
-        <w:t xml:space="preserve"> </w:t>
-      </w:r>
-      <w:r>
-        <w:t xml:space="preserve">binds a TCP port, maintains a</w:t>
-      </w:r>
-      <w:r>
-        <w:t xml:space="preserve"> </w:t>
-      </w:r>
-      <w:r>
-        <w:t xml:space="preserve">peer connection map, and exposes</w:t>
-      </w:r>
-      <w:r>
-        <w:t xml:space="preserve"> </w:t>
-      </w:r>
-      <w:r>
-        <w:rPr>
-          <w:rStyle w:val="VerbatimChar"/>
-        </w:rPr>
-        <w:t xml:space="preserve">remote_send</w:t>
-      </w:r>
-      <w:r>
-        <w:t xml:space="preserve">/</w:t>
-      </w:r>
-      <w:r>
-        <w:rPr>
-          <w:rStyle w:val="VerbatimChar"/>
-        </w:rPr>
-        <w:t xml:space="preserve">remote_await</w:t>
-      </w:r>
-      <w:r>
-        <w:t xml:space="preserve"> </w:t>
-      </w:r>
-      <w:r>
-        <w:t xml:space="preserve">over a newline-delimited JSON wire protocol:</w:t>
-      </w:r>
-    </w:p>
-    <w:p>
-      <w:pPr>
-        <w:pStyle w:val="SourceCode"/>
-      </w:pPr>
-      <w:r>
-        <w:rPr>
-          <w:rStyle w:val="VerbatimChar"/>
-        </w:rPr>
-        <w:t xml:space="preserve">let remote_voter: agentref =</w:t>
-      </w:r>
-      <w:r>
-        <w:br/>
-      </w:r>
-      <w:r>
-        <w:rPr>
-          <w:rStyle w:val="VerbatimChar"/>
-        </w:rPr>
-        <w:t xml:space="preserve">    spawn remote "192.168.1.42:7373" Voter;</w:t>
-      </w:r>
-      <w:r>
-        <w:br/>
-      </w:r>
-      <w:r>
-        <w:rPr>
-          <w:rStyle w:val="VerbatimChar"/>
-        </w:rPr>
-        <w:t xml:space="preserve">send remote_voter truth();</w:t>
-      </w:r>
-      <w:r>
-        <w:br/>
-      </w:r>
-      <w:r>
-        <w:rPr>
-          <w:rStyle w:val="VerbatimChar"/>
-        </w:rPr>
-        <w:t xml:space="preserve">let r: trit = await remote_voter;</w:t>
-      </w:r>
-    </w:p>
-    <w:p>
-      <w:pPr>
-        <w:pStyle w:val="FirstParagraph"/>
-      </w:pPr>
-      <w:r>
-        <w:t xml:space="preserve">The wire protocol uses four message types (</w:t>
-      </w:r>
-      <w:r>
-        <w:rPr>
-          <w:rStyle w:val="VerbatimChar"/>
-        </w:rPr>
-        <w:t xml:space="preserve">Send</w:t>
-      </w:r>
-      <w:r>
-        <w:t xml:space="preserve">,</w:t>
-      </w:r>
-      <w:r>
-        <w:t xml:space="preserve"> </w:t>
-      </w:r>
-      <w:r>
-        <w:rPr>
-          <w:rStyle w:val="VerbatimChar"/>
-        </w:rPr>
-        <w:t xml:space="preserve">Await</w:t>
-      </w:r>
-      <w:r>
-        <w:t xml:space="preserve">,</w:t>
-      </w:r>
-      <w:r>
-        <w:t xml:space="preserve"> </w:t>
-      </w:r>
-      <w:r>
-        <w:rPr>
-          <w:rStyle w:val="VerbatimChar"/>
-        </w:rPr>
-        <w:t xml:space="preserve">Reply</w:t>
-      </w:r>
-      <w:r>
-        <w:t xml:space="preserve">,</w:t>
-      </w:r>
-      <w:r>
-        <w:t xml:space="preserve"> </w:t>
-      </w:r>
-      <w:r>
-        <w:rPr>
-          <w:rStyle w:val="VerbatimChar"/>
-        </w:rPr>
-        <w:t xml:space="preserve">Error</w:t>
-      </w:r>
-      <w:r>
-        <w:t xml:space="preserve">) serialised as tagged JSON objects, enabling</w:t>
-      </w:r>
-      <w:r>
-        <w:t xml:space="preserve"> </w:t>
-      </w:r>
-      <w:r>
-        <w:t xml:space="preserve">interoperability with non-Rust implementations.</w:t>
-      </w:r>
-    </w:p>
-    <w:bookmarkEnd w:id="55"/>
-    <w:bookmarkEnd w:id="56"/>
-    <w:bookmarkStart w:id="61" w:name="sec:reasoning"/>
-    <w:p>
-      <w:pPr>
-        <w:pStyle w:val="Heading1"/>
-      </w:pPr>
-      <w:r>
-        <w:t xml:space="preserve">Ternary AI Reasoning Toolkit</w:t>
-      </w:r>
-    </w:p>
-    <w:p>
-      <w:pPr>
-        <w:pStyle w:val="FirstParagraph"/>
-      </w:pPr>
-      <w:r>
-        <w:t xml:space="preserve">Modern AI agents are structurally binary in their decision loops: evidence</w:t>
-      </w:r>
-      <w:r>
-        <w:t xml:space="preserve"> </w:t>
-      </w:r>
-      <w:r>
-        <w:t xml:space="preserve">is collapsed to a scalar, thresholded, and converted to a Boolean act/wait</w:t>
-      </w:r>
-      <w:r>
-        <w:t xml:space="preserve"> </w:t>
-      </w:r>
-      <w:r>
-        <w:t xml:space="preserve">flag. The three-valued nature of evidence—affirm, hold, reject—is treated</w:t>
-      </w:r>
-      <w:r>
-        <w:t xml:space="preserve"> </w:t>
-      </w:r>
-      <w:r>
-        <w:t xml:space="preserve">as a side-effect of confidence scores rather than a first-class type.</w:t>
-      </w:r>
-    </w:p>
-    <w:p>
-      <w:pPr>
-        <w:pStyle w:val="BodyText"/>
-      </w:pPr>
-      <w:r>
-        <w:t xml:space="preserve">Phase 8 of the TIS introduces five primitives in</w:t>
-      </w:r>
-      <w:r>
-        <w:t xml:space="preserve"> </w:t>
-      </w:r>
-      <w:r>
-        <w:rPr>
-          <w:rStyle w:val="VerbatimChar"/>
-        </w:rPr>
         <w:t xml:space="preserve">ternlang-ml</w:t>
       </w:r>
       <w:r>
@@ -13902,7 +13887,7 @@
         <w:t xml:space="preserve">make the decision loop architecturally ternary.</w:t>
       </w:r>
     </w:p>
-    <w:bookmarkStart w:id="57" w:name="deliberation-engine"/>
+    <w:bookmarkStart w:id="56" w:name="deliberation-engine"/>
     <w:p>
       <w:pPr>
         <w:pStyle w:val="Heading2"/>
@@ -14186,8 +14171,8 @@
         <w:t xml:space="preserve">behaviour—a native ternary computation rather than a binary timeout.</w:t>
       </w:r>
     </w:p>
-    <w:bookmarkEnd w:id="57"/>
-    <w:bookmarkStart w:id="58" w:name="coalition-vote"/>
+    <w:bookmarkEnd w:id="56"/>
+    <w:bookmarkStart w:id="57" w:name="coalition-vote"/>
     <w:p>
       <w:pPr>
         <w:pStyle w:val="Heading2"/>
@@ -14593,8 +14578,8 @@
         <w:t xml:space="preserve">is importance weight.</w:t>
       </w:r>
     </w:p>
-    <w:bookmarkEnd w:id="58"/>
-    <w:bookmarkStart w:id="59" w:name="action-gate"/>
+    <w:bookmarkEnd w:id="57"/>
+    <w:bookmarkStart w:id="58" w:name="action-gate"/>
     <w:p>
       <w:pPr>
         <w:pStyle w:val="Heading2"/>
@@ -14885,8 +14870,8 @@
         <w:t xml:space="preserve">unconditional, not probabilistic.</w:t>
       </w:r>
     </w:p>
-    <w:bookmarkEnd w:id="59"/>
-    <w:bookmarkStart w:id="60" w:name="X95fda703778e6ff08dbdd3a8da94052d50cd11f"/>
+    <w:bookmarkEnd w:id="58"/>
+    <w:bookmarkStart w:id="59" w:name="X95fda703778e6ff08dbdd3a8da94052d50cd11f"/>
     <w:p>
       <w:pPr>
         <w:pStyle w:val="Heading2"/>
@@ -14999,9 +14984,9 @@
         <w:t xml:space="preserve">incoherent and should not be acted upon.</w:t>
       </w:r>
     </w:p>
+    <w:bookmarkEnd w:id="59"/>
     <w:bookmarkEnd w:id="60"/>
-    <w:bookmarkEnd w:id="61"/>
-    <w:bookmarkStart w:id="73" w:name="sec:moe"/>
+    <w:bookmarkStart w:id="72" w:name="sec:moe"/>
     <w:p>
       <w:pPr>
         <w:pStyle w:val="Heading1"/>
@@ -15051,7 +15036,7 @@
         <w:t xml:space="preserve">in balanced ternary semantics.</w:t>
       </w:r>
     </w:p>
-    <w:bookmarkStart w:id="62" w:name="six-dimensional-competence-space"/>
+    <w:bookmarkStart w:id="61" w:name="six-dimensional-competence-space"/>
     <w:p>
       <w:pPr>
         <w:pStyle w:val="Heading2"/>
@@ -15501,8 +15486,8 @@
         </m:oMath>
       </m:oMathPara>
     </w:p>
-    <w:bookmarkEnd w:id="62"/>
-    <w:bookmarkStart w:id="63" w:name="dual-key-synergistic-routing"/>
+    <w:bookmarkEnd w:id="61"/>
+    <w:bookmarkStart w:id="62" w:name="dual-key-synergistic-routing"/>
     <w:p>
       <w:pPr>
         <w:pStyle w:val="Heading2"/>
@@ -15937,8 +15922,8 @@
         <w:t xml:space="preserve">coverage over redundant strength.</w:t>
       </w:r>
     </w:p>
-    <w:bookmarkEnd w:id="63"/>
-    <w:bookmarkStart w:id="64" w:name="triad-synthesis"/>
+    <w:bookmarkEnd w:id="62"/>
+    <w:bookmarkStart w:id="63" w:name="triad-synthesis"/>
     <w:p>
       <w:pPr>
         <w:pStyle w:val="Heading2"/>
@@ -16183,8 +16168,8 @@
         <w:t xml:space="preserve">subsequent vote and the LLM temperature hint.</w:t>
       </w:r>
     </w:p>
-    <w:bookmarkEnd w:id="64"/>
-    <w:bookmarkStart w:id="65" w:name="safety-hard-gate-and-axis-6-veto"/>
+    <w:bookmarkEnd w:id="63"/>
+    <w:bookmarkStart w:id="64" w:name="safety-hard-gate-and-axis-6-veto"/>
     <w:p>
       <w:pPr>
         <w:pStyle w:val="Heading2"/>
@@ -16382,8 +16367,8 @@
         <w:t xml:space="preserve">to the Axis-tier memory for audit. No downstream reasoning can override it.</w:t>
       </w:r>
     </w:p>
-    <w:bookmarkEnd w:id="65"/>
-    <w:bookmarkStart w:id="66" w:name="hold-state-and-tiebreaker"/>
+    <w:bookmarkEnd w:id="64"/>
+    <w:bookmarkStart w:id="65" w:name="hold-state-and-tiebreaker"/>
     <w:p>
       <w:pPr>
         <w:pStyle w:val="Heading2"/>
@@ -16483,8 +16468,8 @@
         <w:t xml:space="preserve">hold state to the caller, signalling that further evidence is needed.</w:t>
       </w:r>
     </w:p>
-    <w:bookmarkEnd w:id="66"/>
-    <w:bookmarkStart w:id="67" w:name="three-tier-memory-mesh"/>
+    <w:bookmarkEnd w:id="65"/>
+    <w:bookmarkStart w:id="66" w:name="three-tier-memory-mesh"/>
     <w:p>
       <w:pPr>
         <w:pStyle w:val="Heading2"/>
@@ -16638,8 +16623,8 @@
         <w:t xml:space="preserve">performance.</w:t>
       </w:r>
     </w:p>
-    <w:bookmarkEnd w:id="67"/>
-    <w:bookmarkStart w:id="68" w:name="nine-step-inference-pipeline"/>
+    <w:bookmarkEnd w:id="66"/>
+    <w:bookmarkStart w:id="67" w:name="nine-step-inference-pipeline"/>
     <w:p>
       <w:pPr>
         <w:pStyle w:val="Heading2"/>
@@ -16747,8 +16732,8 @@
         <w:t xml:space="preserve">and update all three memory tiers.</w:t>
       </w:r>
     </w:p>
-    <w:bookmarkEnd w:id="68"/>
-    <w:bookmarkStart w:id="69" w:name="subsec:harness"/>
+    <w:bookmarkEnd w:id="67"/>
+    <w:bookmarkStart w:id="68" w:name="subsec:harness"/>
     <w:p>
       <w:pPr>
         <w:pStyle w:val="Heading2"/>
@@ -17507,8 +17492,8 @@
         <w:t xml:space="preserve">and further information is required before committing.</w:t>
       </w:r>
     </w:p>
-    <w:bookmarkEnd w:id="69"/>
-    <w:bookmarkStart w:id="70" w:name="subsec:hold"/>
+    <w:bookmarkEnd w:id="68"/>
+    <w:bookmarkStart w:id="69" w:name="subsec:hold"/>
     <w:p>
       <w:pPr>
         <w:pStyle w:val="Heading2"/>
@@ -17952,8 +17937,8 @@
         <w:t xml:space="preserve">the safety dimension is always the most conservative signal in the system.</w:t>
       </w:r>
     </w:p>
-    <w:bookmarkEnd w:id="70"/>
-    <w:bookmarkStart w:id="71" w:name="subsec:orchestrate_full"/>
+    <w:bookmarkEnd w:id="69"/>
+    <w:bookmarkStart w:id="70" w:name="subsec:orchestrate_full"/>
     <w:p>
       <w:pPr>
         <w:pStyle w:val="Heading2"/>
@@ -18137,111 +18122,111 @@
         <w:t xml:space="preserve">only complex or borderline queries reach the full routing pipeline.</w:t>
       </w:r>
     </w:p>
+    <w:bookmarkEnd w:id="70"/>
+    <w:bookmarkStart w:id="71" w:name="mcp-exposure"/>
+    <w:p>
+      <w:pPr>
+        <w:pStyle w:val="Heading2"/>
+      </w:pPr>
+      <w:r>
+        <w:t xml:space="preserve">MCP Exposure</w:t>
+      </w:r>
+    </w:p>
+    <w:p>
+      <w:pPr>
+        <w:pStyle w:val="FirstParagraph"/>
+      </w:pPr>
+      <w:r>
+        <w:t xml:space="preserve">The orchestrator is exposed as three MCP tool calls:</w:t>
+      </w:r>
+      <w:r>
+        <w:t xml:space="preserve"> </w:t>
+      </w:r>
+      <w:r>
+        <w:rPr>
+          <w:rStyle w:val="VerbatimChar"/>
+        </w:rPr>
+        <w:t xml:space="preserve">moe_orchestrate</w:t>
+      </w:r>
+      <w:r>
+        <w:t xml:space="preserve"> </w:t>
+      </w:r>
+      <w:r>
+        <w:t xml:space="preserve">runs a full pass and returns the complete result</w:t>
+      </w:r>
+      <w:r>
+        <w:t xml:space="preserve"> </w:t>
+      </w:r>
+      <w:r>
+        <w:t xml:space="preserve">including routing pair, triad field, verdicts, temperature, and prompt hint;</w:t>
+      </w:r>
+      <w:r>
+        <w:t xml:space="preserve"> </w:t>
+      </w:r>
+      <w:r>
+        <w:rPr>
+          <w:rStyle w:val="VerbatimChar"/>
+        </w:rPr>
+        <w:t xml:space="preserve">moe_deliberate</w:t>
+      </w:r>
+      <w:r>
+        <w:t xml:space="preserve"> </w:t>
+      </w:r>
+      <w:r>
+        <w:t xml:space="preserve">wraps the EMA deliberation engine for multi-round</w:t>
+      </w:r>
+      <w:r>
+        <w:t xml:space="preserve"> </w:t>
+      </w:r>
+      <w:r>
+        <w:t xml:space="preserve">iterative reasoning;</w:t>
+      </w:r>
+      <w:r>
+        <w:t xml:space="preserve"> </w:t>
+      </w:r>
+      <w:r>
+        <w:rPr>
+          <w:rStyle w:val="VerbatimChar"/>
+        </w:rPr>
+        <w:t xml:space="preserve">trit_action_gate</w:t>
+      </w:r>
+      <w:r>
+        <w:t xml:space="preserve"> </w:t>
+      </w:r>
+      <w:r>
+        <w:t xml:space="preserve">exposes the hard-block gate</w:t>
+      </w:r>
+      <w:r>
+        <w:t xml:space="preserve"> </w:t>
+      </w:r>
+      <w:r>
+        <w:t xml:space="preserve">as a standalone safety check. Any MCP-compatible AI client connected to</w:t>
+      </w:r>
+      <w:r>
+        <w:t xml:space="preserve"> </w:t>
+      </w:r>
+      <w:r>
+        <w:rPr>
+          <w:rStyle w:val="VerbatimChar"/>
+        </w:rPr>
+        <w:t xml:space="preserve">ternlang-mcp</w:t>
+      </w:r>
+      <w:r>
+        <w:t xml:space="preserve"> </w:t>
+      </w:r>
+      <w:r>
+        <w:t xml:space="preserve">gains access to the full ternary reasoning stack as</w:t>
+      </w:r>
+      <w:r>
+        <w:t xml:space="preserve"> </w:t>
+      </w:r>
+      <w:r>
+        <w:t xml:space="preserve">tool calls.</w:t>
+      </w:r>
+    </w:p>
     <w:bookmarkEnd w:id="71"/>
-    <w:bookmarkStart w:id="72" w:name="mcp-exposure"/>
-    <w:p>
-      <w:pPr>
-        <w:pStyle w:val="Heading2"/>
-      </w:pPr>
-      <w:r>
-        <w:t xml:space="preserve">MCP Exposure</w:t>
-      </w:r>
-    </w:p>
-    <w:p>
-      <w:pPr>
-        <w:pStyle w:val="FirstParagraph"/>
-      </w:pPr>
-      <w:r>
-        <w:t xml:space="preserve">The orchestrator is exposed as three MCP tool calls:</w:t>
-      </w:r>
-      <w:r>
-        <w:t xml:space="preserve"> </w:t>
-      </w:r>
-      <w:r>
-        <w:rPr>
-          <w:rStyle w:val="VerbatimChar"/>
-        </w:rPr>
-        <w:t xml:space="preserve">moe_orchestrate</w:t>
-      </w:r>
-      <w:r>
-        <w:t xml:space="preserve"> </w:t>
-      </w:r>
-      <w:r>
-        <w:t xml:space="preserve">runs a full pass and returns the complete result</w:t>
-      </w:r>
-      <w:r>
-        <w:t xml:space="preserve"> </w:t>
-      </w:r>
-      <w:r>
-        <w:t xml:space="preserve">including routing pair, triad field, verdicts, temperature, and prompt hint;</w:t>
-      </w:r>
-      <w:r>
-        <w:t xml:space="preserve"> </w:t>
-      </w:r>
-      <w:r>
-        <w:rPr>
-          <w:rStyle w:val="VerbatimChar"/>
-        </w:rPr>
-        <w:t xml:space="preserve">moe_deliberate</w:t>
-      </w:r>
-      <w:r>
-        <w:t xml:space="preserve"> </w:t>
-      </w:r>
-      <w:r>
-        <w:t xml:space="preserve">wraps the EMA deliberation engine for multi-round</w:t>
-      </w:r>
-      <w:r>
-        <w:t xml:space="preserve"> </w:t>
-      </w:r>
-      <w:r>
-        <w:t xml:space="preserve">iterative reasoning;</w:t>
-      </w:r>
-      <w:r>
-        <w:t xml:space="preserve"> </w:t>
-      </w:r>
-      <w:r>
-        <w:rPr>
-          <w:rStyle w:val="VerbatimChar"/>
-        </w:rPr>
-        <w:t xml:space="preserve">trit_action_gate</w:t>
-      </w:r>
-      <w:r>
-        <w:t xml:space="preserve"> </w:t>
-      </w:r>
-      <w:r>
-        <w:t xml:space="preserve">exposes the hard-block gate</w:t>
-      </w:r>
-      <w:r>
-        <w:t xml:space="preserve"> </w:t>
-      </w:r>
-      <w:r>
-        <w:t xml:space="preserve">as a standalone safety check. Any MCP-compatible AI client connected to</w:t>
-      </w:r>
-      <w:r>
-        <w:t xml:space="preserve"> </w:t>
-      </w:r>
-      <w:r>
-        <w:rPr>
-          <w:rStyle w:val="VerbatimChar"/>
-        </w:rPr>
-        <w:t xml:space="preserve">ternlang-mcp</w:t>
-      </w:r>
-      <w:r>
-        <w:t xml:space="preserve"> </w:t>
-      </w:r>
-      <w:r>
-        <w:t xml:space="preserve">gains access to the full ternary reasoning stack as</w:t>
-      </w:r>
-      <w:r>
-        <w:t xml:space="preserve"> </w:t>
-      </w:r>
-      <w:r>
-        <w:t xml:space="preserve">tool calls.</w:t>
-      </w:r>
-    </w:p>
     <w:bookmarkEnd w:id="72"/>
-    <w:bookmarkEnd w:id="73"/>
-    <w:bookmarkStart w:id="82" w:name="sec:albert"/>
+    <w:bookmarkStart w:id="81" w:name="sec:albert"/>
     <w:p>
       <w:pPr>
         <w:pStyle w:val="Heading1"/>
@@ -18304,7 +18289,7 @@
         <w:t xml:space="preserve">training and inference on commodity consumer hardware.</w:t>
       </w:r>
     </w:p>
-    <w:bookmarkStart w:id="75" w:name="architecture"/>
+    <w:bookmarkStart w:id="74" w:name="architecture"/>
     <w:p>
       <w:pPr>
         <w:pStyle w:val="Heading2"/>
@@ -18313,7 +18298,7 @@
         <w:t xml:space="preserve">Architecture</w:t>
       </w:r>
     </w:p>
-    <w:bookmarkStart w:id="74" w:name="tab:albert_arch"/>
+    <w:bookmarkStart w:id="73" w:name="tab:albert_arch"/>
     <w:p>
       <w:pPr>
         <w:pStyle w:val="TableCaption"/>
@@ -18680,7 +18665,7 @@
         </w:tc>
       </w:tr>
     </w:tbl>
-    <w:bookmarkEnd w:id="74"/>
+    <w:bookmarkEnd w:id="73"/>
     <w:p>
       <w:pPr>
         <w:pStyle w:val="BodyText"/>
@@ -18795,8 +18780,8 @@
         <w:t xml:space="preserve">.</w:t>
       </w:r>
     </w:p>
-    <w:bookmarkEnd w:id="75"/>
-    <w:bookmarkStart w:id="76" w:name="X51fc4a62d8608f8e7568b78a8bc931ae06dadb0"/>
+    <w:bookmarkEnd w:id="74"/>
+    <w:bookmarkStart w:id="75" w:name="X51fc4a62d8608f8e7568b78a8bc931ae06dadb0"/>
     <w:p>
       <w:pPr>
         <w:pStyle w:val="Heading2"/>
@@ -19051,8 +19036,8 @@
         <w:t xml:space="preserve">architecture without human intervention—the substrate evolving itself.</w:t>
       </w:r>
     </w:p>
-    <w:bookmarkEnd w:id="76"/>
-    <w:bookmarkStart w:id="77" w:name="training-efficiency-the-50times-speedup"/>
+    <w:bookmarkEnd w:id="75"/>
+    <w:bookmarkStart w:id="76" w:name="training-efficiency-the-50times-speedup"/>
     <w:p>
       <w:pPr>
         <w:pStyle w:val="Heading2"/>
@@ -19331,8 +19316,8 @@
         <w:t xml:space="preserve">.</w:t>
       </w:r>
     </w:p>
-    <w:bookmarkEnd w:id="77"/>
-    <w:bookmarkStart w:id="78" w:name="ternary-training-innovations"/>
+    <w:bookmarkEnd w:id="76"/>
+    <w:bookmarkStart w:id="77" w:name="ternary-training-innovations"/>
     <w:p>
       <w:pPr>
         <w:pStyle w:val="Heading2"/>
@@ -19676,8 +19661,8 @@
         <w:t xml:space="preserve">and rebuilt only on sequence-length change.</w:t>
       </w:r>
     </w:p>
-    <w:bookmarkEnd w:id="78"/>
-    <w:bookmarkStart w:id="80" w:name="training-results"/>
+    <w:bookmarkEnd w:id="77"/>
+    <w:bookmarkStart w:id="79" w:name="training-results"/>
     <w:p>
       <w:pPr>
         <w:pStyle w:val="Heading2"/>
@@ -19686,7 +19671,7 @@
         <w:t xml:space="preserve">Training Results</w:t>
       </w:r>
     </w:p>
-    <w:bookmarkStart w:id="79" w:name="tab:albert_training"/>
+    <w:bookmarkStart w:id="78" w:name="tab:albert_training"/>
     <w:p>
       <w:pPr>
         <w:pStyle w:val="TableCaption"/>
@@ -20081,7 +20066,7 @@
         </w:tc>
       </w:tr>
     </w:tbl>
-    <w:bookmarkEnd w:id="79"/>
+    <w:bookmarkEnd w:id="78"/>
     <w:p>
       <w:pPr>
         <w:pStyle w:val="BodyText"/>
@@ -20238,8 +20223,8 @@
         <w:t xml:space="preserve">empirical rather than theoretical.</w:t>
       </w:r>
     </w:p>
-    <w:bookmarkEnd w:id="80"/>
-    <w:bookmarkStart w:id="81" w:name="last-look-back-llb-safety-protocol"/>
+    <w:bookmarkEnd w:id="79"/>
+    <w:bookmarkStart w:id="80" w:name="last-look-back-llb-safety-protocol"/>
     <w:p>
       <w:pPr>
         <w:pStyle w:val="Heading2"/>
@@ -20393,9 +20378,9 @@
         <w:t xml:space="preserve">compromises.</w:t>
       </w:r>
     </w:p>
+    <w:bookmarkEnd w:id="80"/>
     <w:bookmarkEnd w:id="81"/>
-    <w:bookmarkEnd w:id="82"/>
-    <w:bookmarkStart w:id="85" w:name="sec:qnn"/>
+    <w:bookmarkStart w:id="84" w:name="sec:qnn"/>
     <w:p>
       <w:pPr>
         <w:pStyle w:val="Heading1"/>
@@ -20666,7 +20651,7 @@
         <w:t xml:space="preserve">implementation substrate for QNN inference.</w:t>
       </w:r>
     </w:p>
-    <w:bookmarkStart w:id="83" w:name="tesseract-recursive-syntax-stabilisation"/>
+    <w:bookmarkStart w:id="82" w:name="tesseract-recursive-syntax-stabilisation"/>
     <w:p>
       <w:pPr>
         <w:pStyle w:val="Heading2"/>
@@ -20751,8 +20736,8 @@
         <w:t xml:space="preserve">rather than forcing a premature commitment.</w:t>
       </w:r>
     </w:p>
-    <w:bookmarkEnd w:id="83"/>
-    <w:bookmarkStart w:id="84" w:name="qnn-example-suite"/>
+    <w:bookmarkEnd w:id="82"/>
+    <w:bookmarkStart w:id="83" w:name="qnn-example-suite"/>
     <w:p>
       <w:pPr>
         <w:pStyle w:val="Heading2"/>
@@ -21046,9 +21031,9 @@
         <w:t xml:space="preserve">over dense computation observed in classical BitNet workloads.</w:t>
       </w:r>
     </w:p>
+    <w:bookmarkEnd w:id="83"/>
     <w:bookmarkEnd w:id="84"/>
-    <w:bookmarkEnd w:id="85"/>
-    <w:bookmarkStart w:id="86" w:name="sec:related"/>
+    <w:bookmarkStart w:id="85" w:name="sec:related"/>
     <w:p>
       <w:pPr>
         <w:pStyle w:val="Heading1"/>
@@ -21363,8 +21348,8 @@
         <w:t xml:space="preserve">spaces; we leave the formal mapping to future work.</w:t>
       </w:r>
     </w:p>
-    <w:bookmarkEnd w:id="86"/>
-    <w:bookmarkStart w:id="88" w:name="sec:ecosystem"/>
+    <w:bookmarkEnd w:id="85"/>
+    <w:bookmarkStart w:id="87" w:name="sec:ecosystem"/>
     <w:p>
       <w:pPr>
         <w:pStyle w:val="Heading1"/>
@@ -21435,7 +21420,7 @@
         <w:t xml:space="preserve">.</w:t>
       </w:r>
     </w:p>
-    <w:bookmarkStart w:id="87" w:name="tab:ecosystem"/>
+    <w:bookmarkStart w:id="86" w:name="tab:ecosystem"/>
     <w:p>
       <w:pPr>
         <w:pStyle w:val="TableCaption"/>
@@ -21747,7 +21732,7 @@
         </w:tc>
       </w:tr>
     </w:tbl>
-    <w:bookmarkEnd w:id="87"/>
+    <w:bookmarkEnd w:id="86"/>
     <w:p>
       <w:pPr>
         <w:pStyle w:val="BodyText"/>
@@ -21889,8 +21874,8 @@
         <w:t xml:space="preserve">same VM that drives the MoE-13 orchestrator.</w:t>
       </w:r>
     </w:p>
-    <w:bookmarkEnd w:id="88"/>
-    <w:bookmarkStart w:id="90" w:name="sec:status"/>
+    <w:bookmarkEnd w:id="87"/>
+    <w:bookmarkStart w:id="89" w:name="sec:status"/>
     <w:p>
       <w:pPr>
         <w:pStyle w:val="Heading1"/>
@@ -21907,7 +21892,7 @@
         <w:t xml:space="preserve">Ternlang is implemented in Rust and comprises the following crates:</w:t>
       </w:r>
     </w:p>
-    <w:bookmarkStart w:id="89" w:name="tab:status"/>
+    <w:bookmarkStart w:id="88" w:name="tab:status"/>
     <w:p>
       <w:pPr>
         <w:pStyle w:val="TableCaption"/>
@@ -22617,7 +22602,7 @@
         </w:tc>
       </w:tr>
     </w:tbl>
-    <w:bookmarkEnd w:id="89"/>
+    <w:bookmarkEnd w:id="88"/>
     <w:p>
       <w:pPr>
         <w:pStyle w:val="BodyText"/>
@@ -22931,8 +22916,8 @@
         <w:t xml:space="preserve">and deploys to Fly.io on every push to main.</w:t>
       </w:r>
     </w:p>
-    <w:bookmarkEnd w:id="90"/>
-    <w:bookmarkStart w:id="91" w:name="sec:conclusion"/>
+    <w:bookmarkEnd w:id="89"/>
+    <w:bookmarkStart w:id="90" w:name="sec:conclusion"/>
     <w:p>
       <w:pPr>
         <w:pStyle w:val="Heading1"/>
@@ -23611,7 +23596,7 @@
           <w:i/>
           <w:iCs/>
         </w:rPr>
-        <w:t xml:space="preserve">The Death of the Trit</w:t>
+        <w:t xml:space="preserve">The Death of the Bit</w:t>
       </w:r>
       <w:r>
         <w:t xml:space="preserve">.</w:t>
@@ -23620,19 +23605,25 @@
         <w:t xml:space="preserve"> </w:t>
       </w:r>
       <w:r>
-        <w:t xml:space="preserve">It is not an obituary. It is a claim about what happens when ternary computation</w:t>
-      </w:r>
-      <w:r>
-        <w:t xml:space="preserve"> </w:t>
-      </w:r>
-      <w:r>
-        <w:t xml:space="preserve">matures: like the binary bit before it, the trit stops being a novelty and</w:t>
-      </w:r>
-      <w:r>
-        <w:t xml:space="preserve"> </w:t>
-      </w:r>
-      <w:r>
-        <w:t xml:space="preserve">becomes invisible infrastructure. The goal of the Ternary Intelligence Stack</w:t>
+        <w:t xml:space="preserve">It is not an obituary for the trit—it is an obituary for the bit.</w:t>
+      </w:r>
+      <w:r>
+        <w:t xml:space="preserve"> </w:t>
+      </w:r>
+      <w:r>
+        <w:t xml:space="preserve">It is a claim about what happens when ternary computation matures: the binary bit,</w:t>
+      </w:r>
+      <w:r>
+        <w:t xml:space="preserve"> </w:t>
+      </w:r>
+      <w:r>
+        <w:t xml:space="preserve">the foundational primitive of five decades of computing, stops being the only</w:t>
+      </w:r>
+      <w:r>
+        <w:t xml:space="preserve"> </w:t>
+      </w:r>
+      <w:r>
+        <w:t xml:space="preserve">option and becomes a special case of a more expressive substrate. The goal of the Ternary Intelligence Stack</w:t>
       </w:r>
       <w:r>
         <w:t xml:space="preserve"> </w:t>
@@ -24011,7 +24002,7 @@
         <w:t xml:space="preserve">everything.</w:t>
       </w:r>
     </w:p>
-    <w:bookmarkEnd w:id="91"/>
+    <w:bookmarkEnd w:id="90"/>
     <w:sectPr/>
   </w:body>
 </w:document>
@@ -24131,31 +24122,6 @@
           <w:t xml:space="preserve">https://github.com/eriirfos-eng/ternary-intelligence-stack</w:t>
         </w:r>
       </w:hyperlink>
-    </w:p>
-  </w:footnote>
-  <w:footnote w:id="22">
-    <w:p>
-      <w:pPr>
-        <w:pStyle w:val="FootnoteText"/>
-      </w:pPr>
-      <w:r>
-        <w:rPr>
-          <w:rStyle w:val="FootnoteReference"/>
-        </w:rPr>
-        <w:footnoteRef/>
-      </w:r>
-      <w:r>
-        <w:t xml:space="preserve"> </w:t>
-      </w:r>
-      <w:r>
-        <w:t xml:space="preserve">Contact:</w:t>
-      </w:r>
-      <w:r>
-        <w:t xml:space="preserve"> </w:t>
-      </w:r>
-      <w:r>
-        <w:t xml:space="preserve">s.kepp@ternlang.com</w:t>
-      </w:r>
     </w:p>
   </w:footnote>
 </w:footnotes>

</xml_diff>

<commit_message>
docs(whitepaper): simplify subtitle to just "The Death of the Bit."
Remove "The Autonomous Substrate ---" prefix from subtitle.
Final title: Ternlang: A Full-Stack Balanced Ternary Execution
Architecture for Sparse Neural Inference and Ambiguity-Aware Agent
Systems / The Death of the Bit.

Co-Authored-By: Claude Sonnet 4.6 <noreply@anthropic.com>
</commit_message>
<xml_diff>
--- a/ternlang-root/docs/whitepaper/ternlang-whitepaper-v2.0.0.docx
+++ b/ternlang-root/docs/whitepaper/ternlang-whitepaper-v2.0.0.docx
@@ -115,7 +115,7 @@
           <w:i/>
           <w:iCs/>
         </w:rPr>
-        <w:t xml:space="preserve">Autonomous</w:t>
+        <w:t xml:space="preserve">Death</w:t>
       </w:r>
       <w:r>
         <w:rPr>
@@ -129,7 +129,7 @@
           <w:i/>
           <w:iCs/>
         </w:rPr>
-        <w:t xml:space="preserve">Substrate</w:t>
+        <w:t xml:space="preserve">of</w:t>
       </w:r>
       <w:r>
         <w:rPr>
@@ -143,7 +143,7 @@
           <w:i/>
           <w:iCs/>
         </w:rPr>
-        <w:t xml:space="preserve">—</w:t>
+        <w:t xml:space="preserve">the</w:t>
       </w:r>
       <w:r>
         <w:rPr>
@@ -157,63 +157,7 @@
           <w:i/>
           <w:iCs/>
         </w:rPr>
-        <w:t xml:space="preserve">The</w:t>
-      </w:r>
-      <w:r>
-        <w:rPr>
-          <w:i/>
-          <w:iCs/>
-        </w:rPr>
-        <w:t xml:space="preserve"> </w:t>
-      </w:r>
-      <w:r>
-        <w:rPr>
-          <w:i/>
-          <w:iCs/>
-        </w:rPr>
-        <w:t xml:space="preserve">Death</w:t>
-      </w:r>
-      <w:r>
-        <w:rPr>
-          <w:i/>
-          <w:iCs/>
-        </w:rPr>
-        <w:t xml:space="preserve"> </w:t>
-      </w:r>
-      <w:r>
-        <w:rPr>
-          <w:i/>
-          <w:iCs/>
-        </w:rPr>
-        <w:t xml:space="preserve">of</w:t>
-      </w:r>
-      <w:r>
-        <w:rPr>
-          <w:i/>
-          <w:iCs/>
-        </w:rPr>
-        <w:t xml:space="preserve"> </w:t>
-      </w:r>
-      <w:r>
-        <w:rPr>
-          <w:i/>
-          <w:iCs/>
-        </w:rPr>
-        <w:t xml:space="preserve">the</w:t>
-      </w:r>
-      <w:r>
-        <w:rPr>
-          <w:i/>
-          <w:iCs/>
-        </w:rPr>
-        <w:t xml:space="preserve"> </w:t>
-      </w:r>
-      <w:r>
-        <w:rPr>
-          <w:i/>
-          <w:iCs/>
-        </w:rPr>
-        <w:t xml:space="preserve">Bit</w:t>
+        <w:t xml:space="preserve">Bit.</w:t>
       </w:r>
     </w:p>
     <w:p>
@@ -22931,17 +22875,7 @@
         <w:pStyle w:val="FirstParagraph"/>
       </w:pPr>
       <w:r>
-        <w:t xml:space="preserve">We have presented Ternlang v2.0.0—</w:t>
-      </w:r>
-      <w:r>
-        <w:rPr>
-          <w:i/>
-          <w:iCs/>
-        </w:rPr>
-        <w:t xml:space="preserve">The Autonomous Substrate</w:t>
-      </w:r>
-      <w:r>
-        <w:t xml:space="preserve">—a</w:t>
+        <w:t xml:space="preserve">We have presented Ternlang v2.0.0, a</w:t>
       </w:r>
       <w:r>
         <w:t xml:space="preserve"> </w:t>

</xml_diff>